<commit_message>
27.0.0.13 SalesOrderConf layout reviewed
</commit_message>
<xml_diff>
--- a/ReportLayouts/wanSalesOrderConf.docx
+++ b/ReportLayouts/wanSalesOrderConf.docx
@@ -46,6 +46,7 @@
             <w:dataBinding w:prefixMappings="xmlns:ns0='urn:microsoft-dynamics-nav/reports/Standard_Sales_Order_Conf/1305/'" w:xpath="/ns0:NavWordReportXmlPart[1]/ns0:Header[1]/ns0:wanSellToAddress_Lbl[1]" w:storeItemID="{534044D7-BF80-4F39-BB01-2EBB277C890C}"/>
             <w:text/>
           </w:sdtPr>
+          <w:sdtEndPr/>
           <w:sdtContent>
             <w:tc>
               <w:tcPr>
@@ -63,6 +64,7 @@
                     <w:lang w:val="fr-FR"/>
                   </w:rPr>
                 </w:pPr>
+                <w:proofErr w:type="spellStart"/>
                 <w:r>
                   <w:rPr>
                     <w:sz w:val="18"/>
@@ -71,6 +73,7 @@
                   </w:rPr>
                   <w:t>wanSellToAddress_Lbl</w:t>
                 </w:r>
+                <w:proofErr w:type="spellEnd"/>
               </w:p>
             </w:tc>
           </w:sdtContent>
@@ -90,6 +93,7 @@
             <w:dataBinding w:prefixMappings="xmlns:ns0='urn:microsoft-dynamics-nav/reports/Standard_Sales_Order_Conf/1305/'" w:xpath="/ns0:NavWordReportXmlPart[1]/ns0:Header[1]/ns0:wanShipToAddress_Lbl[1]" w:storeItemID="{534044D7-BF80-4F39-BB01-2EBB277C890C}"/>
             <w:text/>
           </w:sdtPr>
+          <w:sdtEndPr/>
           <w:sdtContent>
             <w:tc>
               <w:tcPr>
@@ -106,6 +110,7 @@
                     <w:szCs w:val="18"/>
                   </w:rPr>
                 </w:pPr>
+                <w:proofErr w:type="spellStart"/>
                 <w:r>
                   <w:rPr>
                     <w:sz w:val="18"/>
@@ -113,6 +118,7 @@
                   </w:rPr>
                   <w:t>wanShipToAddress_Lbl</w:t>
                 </w:r>
+                <w:proofErr w:type="spellEnd"/>
               </w:p>
             </w:tc>
           </w:sdtContent>
@@ -133,6 +139,7 @@
             <w:dataBinding w:prefixMappings="xmlns:ns0='urn:microsoft-dynamics-nav/reports/Standard_Sales_Order_Conf/1305/'" w:xpath="/ns0:NavWordReportXmlPart[1]/ns0:Header[1]/ns0:wanBillToAddress_Lbl[1]" w:storeItemID="{534044D7-BF80-4F39-BB01-2EBB277C890C}"/>
             <w:text/>
           </w:sdtPr>
+          <w:sdtEndPr/>
           <w:sdtContent>
             <w:tc>
               <w:tcPr>
@@ -151,6 +158,7 @@
                     <w:lang w:val="fr-FR"/>
                   </w:rPr>
                 </w:pPr>
+                <w:proofErr w:type="spellStart"/>
                 <w:r>
                   <w:rPr>
                     <w:sz w:val="18"/>
@@ -159,6 +167,7 @@
                   </w:rPr>
                   <w:t>wanBillToAddress_Lbl</w:t>
                 </w:r>
+                <w:proofErr w:type="spellEnd"/>
               </w:p>
             </w:tc>
           </w:sdtContent>
@@ -195,10 +204,13 @@
                 <w:dataBinding w:prefixMappings="xmlns:ns0='urn:microsoft-dynamics-nav/reports/Standard_Sales_Order_Conf/1305/'" w:xpath="/ns0:NavWordReportXmlPart[1]/ns0:Header[1]/ns0:wanSellToAddress[1]" w:storeItemID="{534044D7-BF80-4F39-BB01-2EBB277C890C}"/>
                 <w:text/>
               </w:sdtPr>
+              <w:sdtEndPr/>
               <w:sdtContent>
+                <w:proofErr w:type="spellStart"/>
                 <w:r>
                   <w:t>wanSellToAddress</w:t>
                 </w:r>
+                <w:proofErr w:type="spellEnd"/>
               </w:sdtContent>
             </w:sdt>
             <w:r>
@@ -236,7 +248,9 @@
                 <w:dataBinding w:prefixMappings="xmlns:ns0='urn:microsoft-dynamics-nav/reports/Standard_Sales_Order_Conf/1305/'" w:xpath="/ns0:NavWordReportXmlPart[1]/ns0:Header[1]/ns0:wanOurAccountNo_Lbl[1]" w:storeItemID="{534044D7-BF80-4F39-BB01-2EBB277C890C}"/>
                 <w:text/>
               </w:sdtPr>
+              <w:sdtEndPr/>
               <w:sdtContent>
+                <w:proofErr w:type="spellStart"/>
                 <w:r>
                   <w:rPr>
                     <w:b/>
@@ -247,6 +261,7 @@
                   </w:rPr>
                   <w:t>wanOurAccountNo_Lbl</w:t>
                 </w:r>
+                <w:proofErr w:type="spellEnd"/>
               </w:sdtContent>
             </w:sdt>
             <w:r>
@@ -283,7 +298,9 @@
                 <w:dataBinding w:prefixMappings="xmlns:ns0='urn:microsoft-dynamics-nav/reports/Standard_Sales_Order_Conf/1305/'" w:xpath="/ns0:NavWordReportXmlPart[1]/ns0:Header[1]/ns0:wanOurAccountNo[1]" w:storeItemID="{534044D7-BF80-4F39-BB01-2EBB277C890C}"/>
                 <w:text/>
               </w:sdtPr>
+              <w:sdtEndPr/>
               <w:sdtContent>
+                <w:proofErr w:type="spellStart"/>
                 <w:r>
                   <w:rPr>
                     <w:sz w:val="18"/>
@@ -292,6 +309,7 @@
                   </w:rPr>
                   <w:t>wanOurAccountNo</w:t>
                 </w:r>
+                <w:proofErr w:type="spellEnd"/>
               </w:sdtContent>
             </w:sdt>
           </w:p>
@@ -307,6 +325,7 @@
             <w:dataBinding w:prefixMappings="xmlns:ns0='urn:microsoft-dynamics-nav/reports/Standard_Sales_Order_Conf/1305/'" w:xpath="/ns0:NavWordReportXmlPart[1]/ns0:Header[1]/ns0:wanShipToAddress[1]" w:storeItemID="{534044D7-BF80-4F39-BB01-2EBB277C890C}"/>
             <w:text/>
           </w:sdtPr>
+          <w:sdtEndPr/>
           <w:sdtContent>
             <w:tc>
               <w:tcPr>
@@ -322,9 +341,11 @@
                     <w:tab w:val="left" w:pos="495"/>
                   </w:tabs>
                 </w:pPr>
+                <w:proofErr w:type="spellStart"/>
                 <w:r>
                   <w:t>wanShipToAddress</w:t>
                 </w:r>
+                <w:proofErr w:type="spellEnd"/>
               </w:p>
             </w:tc>
           </w:sdtContent>
@@ -340,6 +361,7 @@
             <w:dataBinding w:prefixMappings="xmlns:ns0='urn:microsoft-dynamics-nav/reports/Standard_Sales_Order_Conf/1305/'" w:xpath="/ns0:NavWordReportXmlPart[1]/ns0:Header[1]/ns0:wanBillToAddress[1]" w:storeItemID="{534044D7-BF80-4F39-BB01-2EBB277C890C}"/>
             <w:text/>
           </w:sdtPr>
+          <w:sdtEndPr/>
           <w:sdtContent>
             <w:tc>
               <w:tcPr>
@@ -352,9 +374,11 @@
                 <w:pPr>
                   <w:pStyle w:val="Sansinterligne"/>
                 </w:pPr>
+                <w:proofErr w:type="spellStart"/>
                 <w:r>
                   <w:t>wanBillToAddress</w:t>
                 </w:r>
+                <w:proofErr w:type="spellEnd"/>
               </w:p>
             </w:tc>
           </w:sdtContent>
@@ -409,6 +433,7 @@
             <w:dataBinding w:prefixMappings="xmlns:ns0='urn:microsoft-dynamics-nav/reports/Standard_Sales_Order_Conf/1305/'" w:xpath="/ns0:NavWordReportXmlPart[1]/ns0:Header[1]/ns0:SalesPersonText_Lbl[1]" w:storeItemID="{534044D7-BF80-4F39-BB01-2EBB277C890C}"/>
             <w:text/>
           </w:sdtPr>
+          <w:sdtEndPr/>
           <w:sdtContent>
             <w:tc>
               <w:tcPr>
@@ -431,15 +456,16 @@
         </w:sdt>
         <w:sdt>
           <w:sdtPr>
+            <w:alias w:val="#Nav: /Header/wanShipmentMethodDescription_Lbl"/>
+            <w:tag w:val="#Nav: Standard_Sales_Order_Conf/1305"/>
             <w:id w:val="-1701541084"/>
             <w:placeholder>
               <w:docPart w:val="DefaultPlaceholder_-1854013440"/>
             </w:placeholder>
             <w:dataBinding w:prefixMappings="xmlns:ns0='urn:microsoft-dynamics-nav/reports/Standard_Sales_Order_Conf/1305/' " w:xpath="/ns0:NavWordReportXmlPart[1]/ns0:Header[1]/ns0:wanShipmentMethodDescription_Lbl[1]" w:storeItemID="{534044D7-BF80-4F39-BB01-2EBB277C890C}"/>
             <w:text/>
-            <w:alias w:val="#Nav: /Header/wanShipmentMethodDescription_Lbl"/>
-            <w:tag w:val="#Nav: Standard_Sales_Order_Conf/1305"/>
           </w:sdtPr>
+          <w:sdtEndPr/>
           <w:sdtContent>
             <w:tc>
               <w:tcPr>
@@ -453,9 +479,11 @@
                 <w:pPr>
                   <w:pStyle w:val="Titre1"/>
                 </w:pPr>
+                <w:proofErr w:type="spellStart"/>
                 <w:r>
                   <w:t>wanShipmentMethodDescription_Lbl</w:t>
                 </w:r>
+                <w:proofErr w:type="spellEnd"/>
               </w:p>
             </w:tc>
           </w:sdtContent>
@@ -474,6 +502,7 @@
             <w:dataBinding w:prefixMappings="xmlns:ns0='urn:microsoft-dynamics-nav/reports/Standard_Sales_Order_Conf/1305/'" w:xpath="/ns0:NavWordReportXmlPart[1]/ns0:Header[1]/ns0:PaymentTermsDescription_Lbl[1]" w:storeItemID="{534044D7-BF80-4F39-BB01-2EBB277C890C}"/>
             <w:text/>
           </w:sdtPr>
+          <w:sdtEndPr/>
           <w:sdtContent>
             <w:tc>
               <w:tcPr>
@@ -513,6 +542,7 @@
             <w:dataBinding w:prefixMappings="xmlns:ns0='urn:microsoft-dynamics-nav/reports/Standard_Sales_Order_Conf/1305/'" w:xpath="/ns0:NavWordReportXmlPart[1]/ns0:Header[1]/ns0:SalesPersonName[1]" w:storeItemID="{534044D7-BF80-4F39-BB01-2EBB277C890C}"/>
             <w:text/>
           </w:sdtPr>
+          <w:sdtEndPr/>
           <w:sdtContent>
             <w:tc>
               <w:tcPr>
@@ -555,6 +585,7 @@
             <w:dataBinding w:prefixMappings="xmlns:ns0='urn:microsoft-dynamics-nav/reports/Standard_Sales_Order_Conf/1305/'" w:xpath="/ns0:NavWordReportXmlPart[1]/ns0:Header[1]/ns0:ShipmentMethodDescription[1]" w:storeItemID="{534044D7-BF80-4F39-BB01-2EBB277C890C}"/>
             <w:text/>
           </w:sdtPr>
+          <w:sdtEndPr/>
           <w:sdtContent>
             <w:tc>
               <w:tcPr>
@@ -600,6 +631,7 @@
             <w:dataBinding w:prefixMappings="xmlns:ns0='urn:microsoft-dynamics-nav/reports/Standard_Sales_Order_Conf/1305/'" w:xpath="/ns0:NavWordReportXmlPart[1]/ns0:Header[1]/ns0:PaymentTermsDescription[1]" w:storeItemID="{534044D7-BF80-4F39-BB01-2EBB277C890C}"/>
             <w:text/>
           </w:sdtPr>
+          <w:sdtEndPr/>
           <w:sdtContent>
             <w:tc>
               <w:tcPr>
@@ -642,6 +674,7 @@
             <w:dataBinding w:prefixMappings="xmlns:ns0='urn:microsoft-dynamics-nav/reports/Standard_Sales_Order_Conf/1305/'" w:xpath="/ns0:NavWordReportXmlPart[1]/ns0:Header[1]/ns0:YourReference_Lbl[1]" w:storeItemID="{534044D7-BF80-4F39-BB01-2EBB277C890C}"/>
             <w:text/>
           </w:sdtPr>
+          <w:sdtEndPr/>
           <w:sdtContent>
             <w:tc>
               <w:tcPr>
@@ -655,12 +688,14 @@
                     <w:szCs w:val="18"/>
                   </w:rPr>
                 </w:pPr>
+                <w:proofErr w:type="spellStart"/>
                 <w:r>
                   <w:rPr>
                     <w:szCs w:val="18"/>
                   </w:rPr>
                   <w:t>YourReference_Lbl</w:t>
                 </w:r>
+                <w:proofErr w:type="spellEnd"/>
               </w:p>
             </w:tc>
           </w:sdtContent>
@@ -670,15 +705,16 @@
             <w:rPr>
               <w:szCs w:val="18"/>
             </w:rPr>
+            <w:alias w:val="#Nav: /Header/wanQuoteNo_Lbl"/>
+            <w:tag w:val="#Nav: Standard_Sales_Order_Conf/1305"/>
             <w:id w:val="-1101716402"/>
             <w:placeholder>
               <w:docPart w:val="DefaultPlaceholder_-1854013440"/>
             </w:placeholder>
             <w:dataBinding w:prefixMappings="xmlns:ns0='urn:microsoft-dynamics-nav/reports/Standard_Sales_Order_Conf/1305/' " w:xpath="/ns0:NavWordReportXmlPart[1]/ns0:Header[1]/ns0:wanQuoteNo_Lbl[1]" w:storeItemID="{534044D7-BF80-4F39-BB01-2EBB277C890C}"/>
             <w:text/>
-            <w:alias w:val="#Nav: /Header/wanQuoteNo_Lbl"/>
-            <w:tag w:val="#Nav: Standard_Sales_Order_Conf/1305"/>
           </w:sdtPr>
+          <w:sdtEndPr/>
           <w:sdtContent>
             <w:tc>
               <w:tcPr>
@@ -692,12 +728,14 @@
                     <w:szCs w:val="18"/>
                   </w:rPr>
                 </w:pPr>
+                <w:proofErr w:type="spellStart"/>
                 <w:r>
                   <w:rPr>
                     <w:szCs w:val="18"/>
                   </w:rPr>
                   <w:t>wanQuoteNo_Lbl</w:t>
                 </w:r>
+                <w:proofErr w:type="spellEnd"/>
               </w:p>
             </w:tc>
           </w:sdtContent>
@@ -716,6 +754,7 @@
             <w:dataBinding w:prefixMappings="xmlns:ns0='urn:microsoft-dynamics-nav/reports/Standard_Sales_Order_Conf/1305/'" w:xpath="/ns0:NavWordReportXmlPart[1]/ns0:Header[1]/ns0:wanReqDelivDate_Lbl[1]" w:storeItemID="{534044D7-BF80-4F39-BB01-2EBB277C890C}"/>
             <w:text/>
           </w:sdtPr>
+          <w:sdtEndPr/>
           <w:sdtContent>
             <w:tc>
               <w:tcPr>
@@ -732,12 +771,14 @@
                     <w:szCs w:val="18"/>
                   </w:rPr>
                 </w:pPr>
+                <w:proofErr w:type="spellStart"/>
                 <w:r>
                   <w:rPr>
                     <w:szCs w:val="18"/>
                   </w:rPr>
                   <w:t>wanReqDelivDate_Lbl</w:t>
                 </w:r>
+                <w:proofErr w:type="spellEnd"/>
               </w:p>
             </w:tc>
           </w:sdtContent>
@@ -758,6 +799,7 @@
             <w:dataBinding w:prefixMappings="xmlns:ns0='urn:microsoft-dynamics-nav/reports/Standard_Sales_Order_Conf/1305/'" w:xpath="/ns0:NavWordReportXmlPart[1]/ns0:Header[1]/ns0:wanPromDelivDate_Lbl[1]" w:storeItemID="{534044D7-BF80-4F39-BB01-2EBB277C890C}"/>
             <w:text/>
           </w:sdtPr>
+          <w:sdtEndPr/>
           <w:sdtContent>
             <w:tc>
               <w:tcPr>
@@ -772,6 +814,7 @@
                     <w:szCs w:val="18"/>
                   </w:rPr>
                 </w:pPr>
+                <w:proofErr w:type="spellStart"/>
                 <w:r>
                   <w:rPr>
                     <w:b/>
@@ -780,6 +823,7 @@
                   </w:rPr>
                   <w:t>wanPromDelivDate_Lbl</w:t>
                 </w:r>
+                <w:proofErr w:type="spellEnd"/>
               </w:p>
             </w:tc>
           </w:sdtContent>
@@ -790,15 +834,16 @@
               <w:szCs w:val="18"/>
               <w:lang w:val="da-DK"/>
             </w:rPr>
+            <w:alias w:val="#Nav: /Header/wanRegistrationNo_Lbl"/>
+            <w:tag w:val="#Nav: Standard_Sales_Order_Conf/1305"/>
             <w:id w:val="1681768995"/>
             <w:placeholder>
               <w:docPart w:val="DefaultPlaceholder_-1854013440"/>
             </w:placeholder>
             <w:dataBinding w:prefixMappings="xmlns:ns0='urn:microsoft-dynamics-nav/reports/Standard_Sales_Order_Conf/1305/' " w:xpath="/ns0:NavWordReportXmlPart[1]/ns0:Header[1]/ns0:wanRegistrationNo_Lbl[1]" w:storeItemID="{534044D7-BF80-4F39-BB01-2EBB277C890C}"/>
             <w:text/>
-            <w:alias w:val="#Nav: /Header/wanRegistrationNo_Lbl"/>
-            <w:tag w:val="#Nav: Standard_Sales_Order_Conf/1305"/>
           </w:sdtPr>
+          <w:sdtEndPr/>
           <w:sdtContent>
             <w:tc>
               <w:tcPr>
@@ -841,6 +886,7 @@
             <w:dataBinding w:prefixMappings="xmlns:ns0='urn:microsoft-dynamics-nav/reports/Standard_Sales_Order_Conf/1305/'" w:xpath="/ns0:NavWordReportXmlPart[1]/ns0:Header[1]/ns0:YourReference[1]" w:storeItemID="{534044D7-BF80-4F39-BB01-2EBB277C890C}"/>
             <w:text/>
           </w:sdtPr>
+          <w:sdtEndPr/>
           <w:sdtContent>
             <w:tc>
               <w:tcPr>
@@ -854,6 +900,7 @@
                     <w:szCs w:val="18"/>
                   </w:rPr>
                 </w:pPr>
+                <w:proofErr w:type="spellStart"/>
                 <w:r>
                   <w:rPr>
                     <w:sz w:val="18"/>
@@ -861,6 +908,7 @@
                   </w:rPr>
                   <w:t>YourReference</w:t>
                 </w:r>
+                <w:proofErr w:type="spellEnd"/>
               </w:p>
             </w:tc>
           </w:sdtContent>
@@ -880,6 +928,7 @@
             <w:dataBinding w:prefixMappings="xmlns:ns0='urn:microsoft-dynamics-nav/reports/Standard_Sales_Order_Conf/1305/' " w:xpath="/ns0:NavWordReportXmlPart[1]/ns0:Header[1]/ns0:QuoteNo[1]" w:storeItemID="{534044D7-BF80-4F39-BB01-2EBB277C890C}"/>
             <w:text/>
           </w:sdtPr>
+          <w:sdtEndPr/>
           <w:sdtContent>
             <w:tc>
               <w:tcPr>
@@ -893,6 +942,7 @@
                     <w:szCs w:val="18"/>
                   </w:rPr>
                 </w:pPr>
+                <w:proofErr w:type="spellStart"/>
                 <w:r>
                   <w:rPr>
                     <w:sz w:val="18"/>
@@ -900,6 +950,7 @@
                   </w:rPr>
                   <w:t>QuoteNo</w:t>
                 </w:r>
+                <w:proofErr w:type="spellEnd"/>
               </w:p>
             </w:tc>
           </w:sdtContent>
@@ -919,6 +970,7 @@
             <w:dataBinding w:prefixMappings="xmlns:ns0='urn:microsoft-dynamics-nav/reports/Standard_Sales_Order_Conf/1305/'" w:xpath="/ns0:NavWordReportXmlPart[1]/ns0:Header[1]/ns0:wanReqDelivDate[1]" w:storeItemID="{534044D7-BF80-4F39-BB01-2EBB277C890C}"/>
             <w:text/>
           </w:sdtPr>
+          <w:sdtEndPr/>
           <w:sdtContent>
             <w:tc>
               <w:tcPr>
@@ -935,6 +987,7 @@
                     <w:szCs w:val="18"/>
                   </w:rPr>
                 </w:pPr>
+                <w:proofErr w:type="spellStart"/>
                 <w:r>
                   <w:rPr>
                     <w:sz w:val="18"/>
@@ -942,6 +995,7 @@
                   </w:rPr>
                   <w:t>wanReqDelivDate</w:t>
                 </w:r>
+                <w:proofErr w:type="spellEnd"/>
               </w:p>
             </w:tc>
           </w:sdtContent>
@@ -961,6 +1015,7 @@
             <w:dataBinding w:prefixMappings="xmlns:ns0='urn:microsoft-dynamics-nav/reports/Standard_Sales_Order_Conf/1305/'" w:xpath="/ns0:NavWordReportXmlPart[1]/ns0:Header[1]/ns0:wanPromDelivDate[1]" w:storeItemID="{534044D7-BF80-4F39-BB01-2EBB277C890C}"/>
             <w:text/>
           </w:sdtPr>
+          <w:sdtEndPr/>
           <w:sdtContent>
             <w:tc>
               <w:tcPr>
@@ -974,6 +1029,7 @@
                     <w:szCs w:val="18"/>
                   </w:rPr>
                 </w:pPr>
+                <w:proofErr w:type="spellStart"/>
                 <w:r>
                   <w:rPr>
                     <w:sz w:val="18"/>
@@ -981,6 +1037,7 @@
                   </w:rPr>
                   <w:t>wanPromDelivDate</w:t>
                 </w:r>
+                <w:proofErr w:type="spellEnd"/>
               </w:p>
             </w:tc>
           </w:sdtContent>
@@ -1001,6 +1058,7 @@
             <w:dataBinding w:prefixMappings="xmlns:ns0='urn:microsoft-dynamics-nav/reports/Standard_Sales_Order_Conf/1305/'" w:xpath="/ns0:NavWordReportXmlPart[1]/ns0:Header[1]/ns0:VATRegistrationNo[1]" w:storeItemID="{534044D7-BF80-4F39-BB01-2EBB277C890C}"/>
             <w:text/>
           </w:sdtPr>
+          <w:sdtEndPr/>
           <w:sdtContent>
             <w:tc>
               <w:tcPr>
@@ -1038,6 +1096,7 @@
         <w15:dataBinding w:prefixMappings="xmlns:ns0='urn:microsoft-dynamics-nav/reports/Standard_Sales_Order_Conf/1305/' " w:xpath="/ns0:NavWordReportXmlPart[1]/ns0:Header[1]/ns0:WorkDescriptionLines" w:storeItemID="{534044D7-BF80-4F39-BB01-2EBB277C890C}"/>
         <w15:repeatingSection/>
       </w:sdtPr>
+      <w:sdtEndPr/>
       <w:sdtContent>
         <w:sdt>
           <w:sdtPr>
@@ -1047,6 +1106,7 @@
             </w:placeholder>
             <w15:repeatingSectionItem/>
           </w:sdtPr>
+          <w:sdtEndPr/>
           <w:sdtContent>
             <w:sdt>
               <w:sdtPr>
@@ -1059,6 +1119,7 @@
                 <w:dataBinding w:prefixMappings="xmlns:ns0='urn:microsoft-dynamics-nav/reports/Standard_Sales_Order_Conf/1305/'" w:xpath="/ns0:NavWordReportXmlPart[1]/ns0:Header[1]/ns0:WorkDescriptionLines[1]/ns0:WorkDescriptionLine[1]" w:storeItemID="{534044D7-BF80-4F39-BB01-2EBB277C890C}"/>
                 <w:text/>
               </w:sdtPr>
+              <w:sdtEndPr/>
               <w:sdtContent>
                 <w:p>
                   <w:pPr>
@@ -1125,6 +1186,7 @@
             <w:dataBinding w:prefixMappings="xmlns:ns0='urn:microsoft-dynamics-nav/reports/Standard_Sales_Order_Conf/1305/'" w:xpath="/ns0:NavWordReportXmlPart[1]/ns0:Header[1]/ns0:Line[1]/ns0:Description_Line_Lbl[1]" w:storeItemID="{534044D7-BF80-4F39-BB01-2EBB277C890C}"/>
             <w:text/>
           </w:sdtPr>
+          <w:sdtEndPr/>
           <w:sdtContent>
             <w:tc>
               <w:tcPr>
@@ -1141,12 +1203,14 @@
                     <w:szCs w:val="18"/>
                   </w:rPr>
                 </w:pPr>
+                <w:proofErr w:type="spellStart"/>
                 <w:r>
                   <w:rPr>
                     <w:szCs w:val="18"/>
                   </w:rPr>
                   <w:t>Description_Line_Lbl</w:t>
                 </w:r>
+                <w:proofErr w:type="spellEnd"/>
               </w:p>
             </w:tc>
           </w:sdtContent>
@@ -1165,6 +1229,7 @@
             <w:dataBinding w:prefixMappings="xmlns:ns0='urn:microsoft-dynamics-nav/reports/Standard_Sales_Order_Conf/1305/'" w:xpath="/ns0:NavWordReportXmlPart[1]/ns0:Header[1]/ns0:Line[1]/ns0:Quantity_Line_Lbl[1]" w:storeItemID="{534044D7-BF80-4F39-BB01-2EBB277C890C}"/>
             <w:text/>
           </w:sdtPr>
+          <w:sdtEndPr/>
           <w:sdtContent>
             <w:tc>
               <w:tcPr>
@@ -1182,12 +1247,14 @@
                     <w:szCs w:val="18"/>
                   </w:rPr>
                 </w:pPr>
+                <w:proofErr w:type="spellStart"/>
                 <w:r>
                   <w:rPr>
                     <w:szCs w:val="18"/>
                   </w:rPr>
                   <w:t>Quantity_Line_Lbl</w:t>
                 </w:r>
+                <w:proofErr w:type="spellEnd"/>
               </w:p>
             </w:tc>
           </w:sdtContent>
@@ -1206,6 +1273,7 @@
             <w:dataBinding w:prefixMappings="xmlns:ns0='urn:microsoft-dynamics-nav/reports/Standard_Sales_Order_Conf/1305/'" w:xpath="/ns0:NavWordReportXmlPart[1]/ns0:Header[1]/ns0:Line[1]/ns0:UnitPrice_Lbl[1]" w:storeItemID="{534044D7-BF80-4F39-BB01-2EBB277C890C}"/>
             <w:text/>
           </w:sdtPr>
+          <w:sdtEndPr/>
           <w:sdtContent>
             <w:tc>
               <w:tcPr>
@@ -1223,12 +1291,14 @@
                     <w:szCs w:val="18"/>
                   </w:rPr>
                 </w:pPr>
+                <w:proofErr w:type="spellStart"/>
                 <w:r>
                   <w:rPr>
                     <w:szCs w:val="18"/>
                   </w:rPr>
                   <w:t>UnitPrice_Lbl</w:t>
                 </w:r>
+                <w:proofErr w:type="spellEnd"/>
               </w:p>
             </w:tc>
           </w:sdtContent>
@@ -1265,6 +1335,7 @@
             <w:dataBinding w:prefixMappings="xmlns:ns0='urn:microsoft-dynamics-nav/reports/Standard_Sales_Order_Conf/1305/'" w:xpath="/ns0:NavWordReportXmlPart[1]/ns0:Header[1]/ns0:Line[1]/ns0:LineAmount_Line_Lbl[1]" w:storeItemID="{534044D7-BF80-4F39-BB01-2EBB277C890C}"/>
             <w:text/>
           </w:sdtPr>
+          <w:sdtEndPr/>
           <w:sdtContent>
             <w:tc>
               <w:tcPr>
@@ -1286,12 +1357,14 @@
                     <w:szCs w:val="18"/>
                   </w:rPr>
                 </w:pPr>
+                <w:proofErr w:type="spellStart"/>
                 <w:r>
                   <w:rPr>
                     <w:szCs w:val="18"/>
                   </w:rPr>
                   <w:t>LineAmount_Line_Lbl</w:t>
                 </w:r>
+                <w:proofErr w:type="spellEnd"/>
               </w:p>
             </w:tc>
           </w:sdtContent>
@@ -1310,6 +1383,7 @@
             <w:dataBinding w:prefixMappings="xmlns:ns0='urn:microsoft-dynamics-nav/reports/Standard_Sales_Order_Conf/1305/'" w:xpath="/ns0:NavWordReportXmlPart[1]/ns0:Header[1]/ns0:Line[1]/ns0:VATPct_Line_Lbl[1]" w:storeItemID="{534044D7-BF80-4F39-BB01-2EBB277C890C}"/>
             <w:text/>
           </w:sdtPr>
+          <w:sdtEndPr/>
           <w:sdtContent>
             <w:tc>
               <w:tcPr>
@@ -1327,12 +1401,14 @@
                     <w:szCs w:val="18"/>
                   </w:rPr>
                 </w:pPr>
+                <w:proofErr w:type="spellStart"/>
                 <w:r>
                   <w:rPr>
                     <w:szCs w:val="18"/>
                   </w:rPr>
                   <w:t>VATPct_Line_Lbl</w:t>
                 </w:r>
+                <w:proofErr w:type="spellEnd"/>
               </w:p>
             </w:tc>
           </w:sdtContent>
@@ -1466,6 +1542,7 @@
           <w15:dataBinding w:prefixMappings="xmlns:ns0='urn:microsoft-dynamics-nav/reports/Standard_Sales_Order_Conf/1305/' " w:xpath="/ns0:NavWordReportXmlPart[1]/ns0:Header[1]/ns0:Line" w:storeItemID="{534044D7-BF80-4F39-BB01-2EBB277C890C}"/>
           <w15:repeatingSection/>
         </w:sdtPr>
+        <w:sdtEndPr/>
         <w:sdtContent>
           <w:sdt>
             <w:sdtPr>
@@ -1479,6 +1556,7 @@
               </w:placeholder>
               <w15:repeatingSectionItem/>
             </w:sdtPr>
+            <w:sdtEndPr/>
             <w:sdtContent>
               <w:tr>
                 <w:trPr>
@@ -1511,7 +1589,9 @@
                         <w:dataBinding w:prefixMappings="xmlns:ns0='urn:microsoft-dynamics-nav/reports/Standard_Sales_Order_Conf/1305/'" w:xpath="/ns0:NavWordReportXmlPart[1]/ns0:Header[1]/ns0:Line[1]/ns0:wanMemoPad[1]" w:storeItemID="{534044D7-BF80-4F39-BB01-2EBB277C890C}"/>
                         <w:text/>
                       </w:sdtPr>
+                      <w:sdtEndPr/>
                       <w:sdtContent>
+                        <w:proofErr w:type="spellStart"/>
                         <w:r>
                           <w:rPr>
                             <w:sz w:val="18"/>
@@ -1519,6 +1599,65 @@
                           </w:rPr>
                           <w:t>wanMemoPad</w:t>
                         </w:r>
+                      </w:sdtContent>
+                    </w:sdt>
+                    <w:sdt>
+                      <w:sdtPr>
+                        <w:rPr>
+                          <w:b/>
+                          <w:bCs/>
+                          <w:sz w:val="18"/>
+                          <w:szCs w:val="18"/>
+                        </w:rPr>
+                        <w:id w:val="-2020141013"/>
+                        <w:placeholder>
+                          <w:docPart w:val="DefaultPlaceholder_-1854013440"/>
+                        </w:placeholder>
+                        <w:dataBinding w:prefixMappings="xmlns:ns0='urn:microsoft-dynamics-nav/reports/Standard_Sales_Order_Conf/1305/' " w:xpath="/ns0:NavWordReportXmlPart[1]/ns0:Header[1]/ns0:Line[1]/ns0:wanTitleMemoPad[1]" w:storeItemID="{534044D7-BF80-4F39-BB01-2EBB277C890C}"/>
+                        <w:text/>
+                        <w:alias w:val="#Nav: /Header/Line/wanTitleMemoPad"/>
+                        <w:tag w:val="#Nav: Standard_Sales_Order_Conf/1305"/>
+                      </w:sdtPr>
+                      <w:sdtContent>
+                        <w:r>
+                          <w:rPr>
+                            <w:b/>
+                            <w:bCs/>
+                            <w:sz w:val="18"/>
+                            <w:szCs w:val="18"/>
+                          </w:rPr>
+                          <w:t>wanTitleMemoPad</w:t>
+                        </w:r>
+                      </w:sdtContent>
+                    </w:sdt>
+                    <w:sdt>
+                      <w:sdtPr>
+                        <w:rPr>
+                          <w:i/>
+                          <w:iCs/>
+                          <w:sz w:val="18"/>
+                          <w:szCs w:val="18"/>
+                        </w:rPr>
+                        <w:id w:val="1767734348"/>
+                        <w:placeholder>
+                          <w:docPart w:val="DefaultPlaceholder_-1854013440"/>
+                        </w:placeholder>
+                        <w:dataBinding w:prefixMappings="xmlns:ns0='urn:microsoft-dynamics-nav/reports/Standard_Sales_Order_Conf/1305/' " w:xpath="/ns0:NavWordReportXmlPart[1]/ns0:Header[1]/ns0:Line[1]/ns0:wanTotalMemoPad[1]" w:storeItemID="{534044D7-BF80-4F39-BB01-2EBB277C890C}"/>
+                        <w:text/>
+                        <w:alias w:val="#Nav: /Header/Line/wanTotalMemoPad"/>
+                        <w:tag w:val="#Nav: Standard_Sales_Order_Conf/1305"/>
+                      </w:sdtPr>
+                      <w:sdtContent>
+                        <w:r>
+                          <w:rPr>
+                            <w:i/>
+                            <w:iCs/>
+                            <w:sz w:val="18"/>
+                            <w:szCs w:val="18"/>
+                          </w:rPr>
+                          <w:t>wanTotalMemoPad</w:t>
+                        </w:r>
+                        <w:proofErr w:type="spellEnd"/>
                       </w:sdtContent>
                     </w:sdt>
                   </w:p>
@@ -1538,6 +1677,7 @@
                     <w:dataBinding w:prefixMappings="xmlns:ns0='urn:microsoft-dynamics-nav/reports/Standard_Sales_Order_Conf/1305/'" w:xpath="/ns0:NavWordReportXmlPart[1]/ns0:Header[1]/ns0:Line[1]/ns0:wanQuantity_UOM[1]" w:storeItemID="{534044D7-BF80-4F39-BB01-2EBB277C890C}"/>
                     <w:text/>
                   </w:sdtPr>
+                  <w:sdtEndPr/>
                   <w:sdtContent>
                     <w:tc>
                       <w:tcPr>
@@ -1551,6 +1691,7 @@
                             <w:szCs w:val="18"/>
                           </w:rPr>
                         </w:pPr>
+                        <w:proofErr w:type="spellStart"/>
                         <w:r>
                           <w:rPr>
                             <w:sz w:val="18"/>
@@ -1558,6 +1699,7 @@
                           </w:rPr>
                           <w:t>wanQuantity_UOM</w:t>
                         </w:r>
+                        <w:proofErr w:type="spellEnd"/>
                       </w:p>
                     </w:tc>
                   </w:sdtContent>
@@ -1577,6 +1719,7 @@
                     <w:dataBinding w:prefixMappings="xmlns:ns0='urn:microsoft-dynamics-nav/reports/Standard_Sales_Order_Conf/1305/'" w:xpath="/ns0:NavWordReportXmlPart[1]/ns0:Header[1]/ns0:Line[1]/ns0:UnitPrice[1]" w:storeItemID="{534044D7-BF80-4F39-BB01-2EBB277C890C}"/>
                     <w:text/>
                   </w:sdtPr>
+                  <w:sdtEndPr/>
                   <w:sdtContent>
                     <w:tc>
                       <w:tcPr>
@@ -1590,6 +1733,7 @@
                             <w:szCs w:val="18"/>
                           </w:rPr>
                         </w:pPr>
+                        <w:proofErr w:type="spellStart"/>
                         <w:r>
                           <w:rPr>
                             <w:sz w:val="18"/>
@@ -1597,6 +1741,7 @@
                           </w:rPr>
                           <w:t>UnitPrice</w:t>
                         </w:r>
+                        <w:proofErr w:type="spellEnd"/>
                       </w:p>
                     </w:tc>
                   </w:sdtContent>
@@ -1616,6 +1761,7 @@
                     <w:dataBinding w:prefixMappings="xmlns:ns0='urn:microsoft-dynamics-nav/reports/Standard_Sales_Order_Conf/1305/'" w:xpath="/ns0:NavWordReportXmlPart[1]/ns0:Header[1]/ns0:Line[1]/ns0:LineDiscountPercentText_Line[1]" w:storeItemID="{534044D7-BF80-4F39-BB01-2EBB277C890C}"/>
                     <w:text/>
                   </w:sdtPr>
+                  <w:sdtEndPr/>
                   <w:sdtContent>
                     <w:tc>
                       <w:tcPr>
@@ -1629,6 +1775,7 @@
                             <w:szCs w:val="18"/>
                           </w:rPr>
                         </w:pPr>
+                        <w:proofErr w:type="spellStart"/>
                         <w:r>
                           <w:rPr>
                             <w:sz w:val="18"/>
@@ -1636,42 +1783,45 @@
                           </w:rPr>
                           <w:t>LineDiscountPercentText_Line</w:t>
                         </w:r>
+                        <w:proofErr w:type="spellEnd"/>
                       </w:p>
                     </w:tc>
                   </w:sdtContent>
                 </w:sdt>
-                <w:sdt>
-                  <w:sdtPr>
-                    <w:rPr>
-                      <w:sz w:val="18"/>
-                      <w:szCs w:val="18"/>
-                    </w:rPr>
-                    <w:alias w:val="#Nav: /Header/Line/LineAmount_Line"/>
-                    <w:tag w:val="#Nav: Standard_Sales_Order_Conf/1305"/>
-                    <w:id w:val="-1829895906"/>
-                    <w:placeholder>
-                      <w:docPart w:val="C9751F1B751A41C5B108D6A599E59261"/>
-                    </w:placeholder>
-                    <w:dataBinding w:prefixMappings="xmlns:ns0='urn:microsoft-dynamics-nav/reports/Standard_Sales_Order_Conf/1305/'" w:xpath="/ns0:NavWordReportXmlPart[1]/ns0:Header[1]/ns0:Line[1]/ns0:LineAmount_Line[1]" w:storeItemID="{534044D7-BF80-4F39-BB01-2EBB277C890C}"/>
-                    <w:text/>
-                  </w:sdtPr>
-                  <w:sdtContent>
-                    <w:tc>
-                      <w:tcPr>
-                        <w:tcW w:w="1134" w:type="dxa"/>
-                        <w:gridSpan w:val="2"/>
-                        <w:tcMar>
-                          <w:right w:w="0" w:type="dxa"/>
-                        </w:tcMar>
-                      </w:tcPr>
-                      <w:p>
-                        <w:pPr>
-                          <w:jc w:val="right"/>
-                          <w:rPr>
-                            <w:sz w:val="18"/>
-                            <w:szCs w:val="18"/>
-                          </w:rPr>
-                        </w:pPr>
+                <w:tc>
+                  <w:tcPr>
+                    <w:tcW w:w="1134" w:type="dxa"/>
+                    <w:gridSpan w:val="2"/>
+                    <w:tcMar>
+                      <w:right w:w="0" w:type="dxa"/>
+                    </w:tcMar>
+                  </w:tcPr>
+                  <w:p>
+                    <w:pPr>
+                      <w:jc w:val="right"/>
+                      <w:rPr>
+                        <w:sz w:val="18"/>
+                        <w:szCs w:val="18"/>
+                      </w:rPr>
+                    </w:pPr>
+                    <w:sdt>
+                      <w:sdtPr>
+                        <w:rPr>
+                          <w:sz w:val="18"/>
+                          <w:szCs w:val="18"/>
+                        </w:rPr>
+                        <w:alias w:val="#Nav: /Header/Line/LineAmount_Line"/>
+                        <w:tag w:val="#Nav: Standard_Sales_Order_Conf/1305"/>
+                        <w:id w:val="-1829895906"/>
+                        <w:placeholder>
+                          <w:docPart w:val="C9751F1B751A41C5B108D6A599E59261"/>
+                        </w:placeholder>
+                        <w:dataBinding w:prefixMappings="xmlns:ns0='urn:microsoft-dynamics-nav/reports/Standard_Sales_Order_Conf/1305/'" w:xpath="/ns0:NavWordReportXmlPart[1]/ns0:Header[1]/ns0:Line[1]/ns0:LineAmount_Line[1]" w:storeItemID="{534044D7-BF80-4F39-BB01-2EBB277C890C}"/>
+                        <w:text/>
+                      </w:sdtPr>
+                      <w:sdtEndPr/>
+                      <w:sdtContent>
+                        <w:proofErr w:type="spellStart"/>
                         <w:r>
                           <w:rPr>
                             <w:sz w:val="18"/>
@@ -1679,10 +1829,40 @@
                           </w:rPr>
                           <w:t>LineAmount_Line</w:t>
                         </w:r>
-                      </w:p>
-                    </w:tc>
-                  </w:sdtContent>
-                </w:sdt>
+                      </w:sdtContent>
+                    </w:sdt>
+                    <w:sdt>
+                      <w:sdtPr>
+                        <w:rPr>
+                          <w:b/>
+                          <w:bCs/>
+                          <w:sz w:val="18"/>
+                          <w:szCs w:val="18"/>
+                        </w:rPr>
+                        <w:id w:val="-1751659432"/>
+                        <w:placeholder>
+                          <w:docPart w:val="DefaultPlaceholder_-1854013440"/>
+                        </w:placeholder>
+                        <w:dataBinding w:prefixMappings="xmlns:ns0='urn:microsoft-dynamics-nav/reports/Standard_Sales_Order_Conf/1305/' " w:xpath="/ns0:NavWordReportXmlPart[1]/ns0:Header[1]/ns0:Line[1]/ns0:wanTotalLineAmount[1]" w:storeItemID="{534044D7-BF80-4F39-BB01-2EBB277C890C}"/>
+                        <w:text/>
+                        <w:alias w:val="#Nav: /Header/Line/wanTotalLineAmount"/>
+                        <w:tag w:val="#Nav: Standard_Sales_Order_Conf/1305"/>
+                      </w:sdtPr>
+                      <w:sdtContent>
+                        <w:r>
+                          <w:rPr>
+                            <w:b/>
+                            <w:bCs/>
+                            <w:sz w:val="18"/>
+                            <w:szCs w:val="18"/>
+                          </w:rPr>
+                          <w:t>wanTotalLineAmount</w:t>
+                        </w:r>
+                        <w:proofErr w:type="spellEnd"/>
+                      </w:sdtContent>
+                    </w:sdt>
+                  </w:p>
+                </w:tc>
                 <w:tc>
                   <w:tcPr>
                     <w:tcW w:w="567" w:type="dxa"/>
@@ -1710,7 +1890,9 @@
                         <w:dataBinding w:prefixMappings="xmlns:ns0='urn:microsoft-dynamics-nav/reports/Standard_Sales_Order_Conf/1305/'" w:xpath="/ns0:NavWordReportXmlPart[1]/ns0:Header[1]/ns0:Line[1]/ns0:VATPct_Line[1]" w:storeItemID="{534044D7-BF80-4F39-BB01-2EBB277C890C}"/>
                         <w:text/>
                       </w:sdtPr>
+                      <w:sdtEndPr/>
                       <w:sdtContent>
+                        <w:proofErr w:type="spellStart"/>
                         <w:r>
                           <w:rPr>
                             <w:sz w:val="18"/>
@@ -1718,6 +1900,7 @@
                           </w:rPr>
                           <w:t>VATPct_Line</w:t>
                         </w:r>
+                        <w:proofErr w:type="spellEnd"/>
                       </w:sdtContent>
                     </w:sdt>
                   </w:p>
@@ -1852,6 +2035,7 @@
           <w15:dataBinding w:prefixMappings="xmlns:ns0='urn:microsoft-dynamics-nav/reports/Standard_Sales_Order_Conf/1305/' " w:xpath="/ns0:NavWordReportXmlPart[1]/ns0:Header[1]/ns0:ReportTotalsLine" w:storeItemID="{534044D7-BF80-4F39-BB01-2EBB277C890C}"/>
           <w15:repeatingSection/>
         </w:sdtPr>
+        <w:sdtEndPr/>
         <w:sdtContent>
           <w:sdt>
             <w:sdtPr>
@@ -1865,6 +2049,7 @@
               </w:placeholder>
               <w15:repeatingSectionItem/>
             </w:sdtPr>
+            <w:sdtEndPr/>
             <w:sdtContent>
               <w:tr>
                 <w:trPr>
@@ -1903,6 +2088,7 @@
                     <w:dataBinding w:prefixMappings="xmlns:ns0='urn:microsoft-dynamics-nav/reports/Standard_Sales_Order_Conf/1305/'" w:xpath="/ns0:NavWordReportXmlPart[1]/ns0:Header[1]/ns0:ReportTotalsLine[1]/ns0:Description_ReportTotalsLine[1]" w:storeItemID="{534044D7-BF80-4F39-BB01-2EBB277C890C}"/>
                     <w:text/>
                   </w:sdtPr>
+                  <w:sdtEndPr/>
                   <w:sdtContent>
                     <w:tc>
                       <w:tcPr>
@@ -1923,6 +2109,7 @@
                             <w:lang w:val="fr-FR"/>
                           </w:rPr>
                         </w:pPr>
+                        <w:proofErr w:type="spellStart"/>
                         <w:r>
                           <w:rPr>
                             <w:b/>
@@ -1933,6 +2120,7 @@
                           </w:rPr>
                           <w:t>Description_ReportTotalsLine</w:t>
                         </w:r>
+                        <w:proofErr w:type="spellEnd"/>
                       </w:p>
                     </w:tc>
                   </w:sdtContent>
@@ -1954,6 +2142,7 @@
                     <w:dataBinding w:prefixMappings="xmlns:ns0='urn:microsoft-dynamics-nav/reports/Standard_Sales_Order_Conf/1305/'" w:xpath="/ns0:NavWordReportXmlPart[1]/ns0:Header[1]/ns0:ReportTotalsLine[1]/ns0:Amount_ReportTotalsLine[1]" w:storeItemID="{534044D7-BF80-4F39-BB01-2EBB277C890C}"/>
                     <w:text/>
                   </w:sdtPr>
+                  <w:sdtEndPr/>
                   <w:sdtContent>
                     <w:tc>
                       <w:tcPr>
@@ -1975,6 +2164,7 @@
                             <w:szCs w:val="18"/>
                           </w:rPr>
                         </w:pPr>
+                        <w:proofErr w:type="spellStart"/>
                         <w:r>
                           <w:rPr>
                             <w:b/>
@@ -1984,6 +2174,7 @@
                           </w:rPr>
                           <w:t>Amount_ReportTotalsLine</w:t>
                         </w:r>
+                        <w:proofErr w:type="spellEnd"/>
                       </w:p>
                     </w:tc>
                   </w:sdtContent>
@@ -2012,6 +2203,7 @@
             <w:dataBinding w:prefixMappings="xmlns:ns0='urn:microsoft-dynamics-nav/reports/Standard_Sales_Order_Conf/1305/'" w:xpath="/ns0:NavWordReportXmlPart[1]/ns0:Header[1]/ns0:Totals[1]/ns0:wanTotalNetWeight[1]" w:storeItemID="{534044D7-BF80-4F39-BB01-2EBB277C890C}"/>
             <w:text/>
           </w:sdtPr>
+          <w:sdtEndPr/>
           <w:sdtContent>
             <w:tc>
               <w:tcPr>
@@ -2025,6 +2217,7 @@
                     <w:szCs w:val="18"/>
                   </w:rPr>
                 </w:pPr>
+                <w:proofErr w:type="spellStart"/>
                 <w:r>
                   <w:rPr>
                     <w:sz w:val="18"/>
@@ -2032,6 +2225,7 @@
                   </w:rPr>
                   <w:t>wanTotalNetWeight</w:t>
                 </w:r>
+                <w:proofErr w:type="spellEnd"/>
               </w:p>
             </w:tc>
           </w:sdtContent>
@@ -2091,6 +2285,7 @@
             <w:dataBinding w:prefixMappings="xmlns:ns0='urn:microsoft-dynamics-nav/reports/Standard_Sales_Order_Conf/1305/'" w:xpath="/ns0:NavWordReportXmlPart[1]/ns0:Header[1]/ns0:wanVATClause[1]" w:storeItemID="{534044D7-BF80-4F39-BB01-2EBB277C890C}"/>
             <w:text/>
           </w:sdtPr>
+          <w:sdtEndPr/>
           <w:sdtContent>
             <w:tc>
               <w:tcPr>
@@ -2104,6 +2299,7 @@
                     <w:szCs w:val="18"/>
                   </w:rPr>
                 </w:pPr>
+                <w:proofErr w:type="spellStart"/>
                 <w:r>
                   <w:rPr>
                     <w:sz w:val="18"/>
@@ -2111,6 +2307,7 @@
                   </w:rPr>
                   <w:t>wanVATClause</w:t>
                 </w:r>
+                <w:proofErr w:type="spellEnd"/>
               </w:p>
             </w:tc>
           </w:sdtContent>
@@ -2131,6 +2328,11 @@
             <w:dataBinding w:prefixMappings="xmlns:ns0='urn:microsoft-dynamics-nav/reports/Standard_Sales_Order_Conf/1305/'" w:xpath="/ns0:NavWordReportXmlPart[1]/ns0:Header[1]/ns0:Totals[1]/ns0:TotalIncludingVATText[1]" w:storeItemID="{534044D7-BF80-4F39-BB01-2EBB277C890C}"/>
             <w:text/>
           </w:sdtPr>
+          <w:sdtEndPr>
+            <w:rPr>
+              <w:rStyle w:val="lev"/>
+            </w:rPr>
+          </w:sdtEndPr>
           <w:sdtContent>
             <w:tc>
               <w:tcPr>
@@ -2149,6 +2351,7 @@
                     <w:szCs w:val="18"/>
                   </w:rPr>
                 </w:pPr>
+                <w:proofErr w:type="spellStart"/>
                 <w:r>
                   <w:rPr>
                     <w:rStyle w:val="lev"/>
@@ -2157,6 +2360,7 @@
                   </w:rPr>
                   <w:t>TotalIncludingVATText</w:t>
                 </w:r>
+                <w:proofErr w:type="spellEnd"/>
               </w:p>
             </w:tc>
           </w:sdtContent>
@@ -2177,6 +2381,11 @@
             <w:dataBinding w:prefixMappings="xmlns:ns0='urn:microsoft-dynamics-nav/reports/Standard_Sales_Order_Conf/1305/'" w:xpath="/ns0:NavWordReportXmlPart[1]/ns0:Header[1]/ns0:Totals[1]/ns0:TotalAmountIncludingVAT[1]" w:storeItemID="{534044D7-BF80-4F39-BB01-2EBB277C890C}"/>
             <w:text/>
           </w:sdtPr>
+          <w:sdtEndPr>
+            <w:rPr>
+              <w:rStyle w:val="lev"/>
+            </w:rPr>
+          </w:sdtEndPr>
           <w:sdtContent>
             <w:tc>
               <w:tcPr>
@@ -2199,6 +2408,7 @@
                     <w:szCs w:val="18"/>
                   </w:rPr>
                 </w:pPr>
+                <w:proofErr w:type="spellStart"/>
                 <w:r>
                   <w:rPr>
                     <w:rStyle w:val="lev"/>
@@ -2207,6 +2417,7 @@
                   </w:rPr>
                   <w:t>TotalAmountIncludingVAT</w:t>
                 </w:r>
+                <w:proofErr w:type="spellEnd"/>
               </w:p>
             </w:tc>
           </w:sdtContent>
@@ -2249,7 +2460,9 @@
                 <w:dataBinding w:prefixMappings="xmlns:ns0='urn:microsoft-dynamics-nav/reports/Standard_Sales_Order_Conf/1305/'" w:xpath="/ns0:NavWordReportXmlPart[1]/ns0:Header[1]/ns0:CompanyBankName_Lbl[1]" w:storeItemID="{534044D7-BF80-4F39-BB01-2EBB277C890C}"/>
                 <w:text/>
               </w:sdtPr>
+              <w:sdtEndPr/>
               <w:sdtContent>
+                <w:proofErr w:type="spellStart"/>
                 <w:r>
                   <w:rPr>
                     <w:sz w:val="18"/>
@@ -2257,6 +2470,7 @@
                   </w:rPr>
                   <w:t>CompanyBankName_Lbl</w:t>
                 </w:r>
+                <w:proofErr w:type="spellEnd"/>
               </w:sdtContent>
             </w:sdt>
             <w:r>
@@ -2281,6 +2495,7 @@
                 <w:dataBinding w:prefixMappings="xmlns:ns0='urn:microsoft-dynamics-nav/reports/Standard_Sales_Order_Conf/1305/'" w:xpath="/ns0:NavWordReportXmlPart[1]/ns0:Header[1]/ns0:CompanyBankName[1]" w:storeItemID="{534044D7-BF80-4F39-BB01-2EBB277C890C}"/>
                 <w:text/>
               </w:sdtPr>
+              <w:sdtEndPr/>
               <w:sdtContent>
                 <w:r>
                   <w:rPr>
@@ -2320,7 +2535,9 @@
                 <w:dataBinding w:prefixMappings="xmlns:ns0='urn:microsoft-dynamics-nav/reports/Standard_Sales_Order_Conf/1305/'" w:xpath="/ns0:NavWordReportXmlPart[1]/ns0:Header[1]/ns0:CompanyIBAN_Lbl[1]" w:storeItemID="{534044D7-BF80-4F39-BB01-2EBB277C890C}"/>
                 <w:text/>
               </w:sdtPr>
+              <w:sdtEndPr/>
               <w:sdtContent>
+                <w:proofErr w:type="spellStart"/>
                 <w:r>
                   <w:rPr>
                     <w:sz w:val="18"/>
@@ -2328,6 +2545,7 @@
                   </w:rPr>
                   <w:t>CompanyIBAN_Lbl</w:t>
                 </w:r>
+                <w:proofErr w:type="spellEnd"/>
               </w:sdtContent>
             </w:sdt>
             <w:r>
@@ -2352,7 +2570,9 @@
                 <w:dataBinding w:prefixMappings="xmlns:ns0='urn:microsoft-dynamics-nav/reports/Standard_Sales_Order_Conf/1305/'" w:xpath="/ns0:NavWordReportXmlPart[1]/ns0:Header[1]/ns0:CompanyIBAN[1]" w:storeItemID="{534044D7-BF80-4F39-BB01-2EBB277C890C}"/>
                 <w:text/>
               </w:sdtPr>
+              <w:sdtEndPr/>
               <w:sdtContent>
+                <w:proofErr w:type="spellStart"/>
                 <w:r>
                   <w:rPr>
                     <w:sz w:val="18"/>
@@ -2360,6 +2580,7 @@
                   </w:rPr>
                   <w:t>CompanyIBAN</w:t>
                 </w:r>
+                <w:proofErr w:type="spellEnd"/>
               </w:sdtContent>
             </w:sdt>
             <w:r>
@@ -2391,7 +2612,9 @@
                 <w:dataBinding w:prefixMappings="xmlns:ns0='urn:microsoft-dynamics-nav/reports/Standard_Sales_Order_Conf/1305/'" w:xpath="/ns0:NavWordReportXmlPart[1]/ns0:Header[1]/ns0:CompanySWIFT_Lbl[1]" w:storeItemID="{534044D7-BF80-4F39-BB01-2EBB277C890C}"/>
                 <w:text/>
               </w:sdtPr>
+              <w:sdtEndPr/>
               <w:sdtContent>
+                <w:proofErr w:type="spellStart"/>
                 <w:r>
                   <w:rPr>
                     <w:sz w:val="18"/>
@@ -2399,6 +2622,7 @@
                   </w:rPr>
                   <w:t>CompanySWIFT_Lbl</w:t>
                 </w:r>
+                <w:proofErr w:type="spellEnd"/>
               </w:sdtContent>
             </w:sdt>
             <w:r>
@@ -2423,7 +2647,9 @@
                 <w:dataBinding w:prefixMappings="xmlns:ns0='urn:microsoft-dynamics-nav/reports/Standard_Sales_Order_Conf/1305/'" w:xpath="/ns0:NavWordReportXmlPart[1]/ns0:Header[1]/ns0:CompanySWIFT[1]" w:storeItemID="{534044D7-BF80-4F39-BB01-2EBB277C890C}"/>
                 <w:text/>
               </w:sdtPr>
+              <w:sdtEndPr/>
               <w:sdtContent>
+                <w:proofErr w:type="spellStart"/>
                 <w:r>
                   <w:rPr>
                     <w:sz w:val="18"/>
@@ -2431,12 +2657,38 @@
                   </w:rPr>
                   <w:t>CompanySWIFT</w:t>
                 </w:r>
+                <w:proofErr w:type="spellEnd"/>
               </w:sdtContent>
             </w:sdt>
           </w:p>
         </w:tc>
       </w:tr>
     </w:tbl>
+    <w:p>
+      <w:pPr>
+        <w:spacing w:after="160" w:line="259" w:lineRule="auto"/>
+        <w:rPr>
+          <w:sz w:val="12"/>
+          <w:szCs w:val="12"/>
+        </w:rPr>
+      </w:pPr>
+    </w:p>
+    <w:p>
+      <w:pPr>
+        <w:spacing w:after="160" w:line="259" w:lineRule="auto"/>
+        <w:rPr>
+          <w:sz w:val="12"/>
+          <w:szCs w:val="12"/>
+        </w:rPr>
+      </w:pPr>
+      <w:r>
+        <w:rPr>
+          <w:sz w:val="12"/>
+          <w:szCs w:val="12"/>
+        </w:rPr>
+        <w:br w:type="page"/>
+      </w:r>
+    </w:p>
     <w:p>
       <w:pPr>
         <w:spacing w:after="160" w:line="259" w:lineRule="auto"/>
@@ -2525,6 +2777,7 @@
           <w:dataBinding w:prefixMappings="xmlns:ns0='urn:microsoft-dynamics-nav/reports/Standard_Sales_Order_Conf/1305/'" w:xpath="/ns0:NavWordReportXmlPart[1]/ns0:Header[1]/ns0:CompanyLegalStatement[1]" w:storeItemID="{534044D7-BF80-4F39-BB01-2EBB277C890C}"/>
           <w:text/>
         </w:sdtPr>
+        <w:sdtEndPr/>
         <w:sdtContent>
           <w:tc>
             <w:tcPr>
@@ -2597,6 +2850,7 @@
           <w:dataBinding w:prefixMappings="xmlns:ns0='urn:microsoft-dynamics-nav/reports/Standard_Sales_Order_Conf/1305/'" w:xpath="/ns0:NavWordReportXmlPart[1]/ns0:Header[1]/ns0:wanCompanyAddress[1]" w:storeItemID="{534044D7-BF80-4F39-BB01-2EBB277C890C}"/>
           <w:text/>
         </w:sdtPr>
+        <w:sdtEndPr/>
         <w:sdtContent>
           <w:tc>
             <w:tcPr>
@@ -2615,6 +2869,7 @@
                   <w:szCs w:val="18"/>
                 </w:rPr>
               </w:pPr>
+              <w:proofErr w:type="spellStart"/>
               <w:r>
                 <w:rPr>
                   <w:sz w:val="18"/>
@@ -2622,6 +2877,7 @@
                 </w:rPr>
                 <w:t>wanCompanyAddress</w:t>
               </w:r>
+              <w:proofErr w:type="spellEnd"/>
             </w:p>
           </w:tc>
         </w:sdtContent>
@@ -2641,6 +2897,7 @@
           <w:dataBinding w:prefixMappings="xmlns:ns0='urn:microsoft-dynamics-nav/reports/Standard_Sales_Order_Conf/1305/'" w:xpath="/ns0:NavWordReportXmlPart[1]/ns0:Header[1]/ns0:wanCompanyContactInfo[1]" w:storeItemID="{534044D7-BF80-4F39-BB01-2EBB277C890C}"/>
           <w:text/>
         </w:sdtPr>
+        <w:sdtEndPr/>
         <w:sdtContent>
           <w:tc>
             <w:tcPr>
@@ -2656,6 +2913,7 @@
                   <w:szCs w:val="18"/>
                 </w:rPr>
               </w:pPr>
+              <w:proofErr w:type="spellStart"/>
               <w:r>
                 <w:rPr>
                   <w:sz w:val="18"/>
@@ -2663,6 +2921,7 @@
                 </w:rPr>
                 <w:t>wanCompanyContactInfo</w:t>
               </w:r>
+              <w:proofErr w:type="spellEnd"/>
             </w:p>
           </w:tc>
         </w:sdtContent>
@@ -2682,6 +2941,7 @@
           <w:dataBinding w:prefixMappings="xmlns:ns0='urn:microsoft-dynamics-nav/reports/Standard_Sales_Order_Conf/1305/'" w:xpath="/ns0:NavWordReportXmlPart[1]/ns0:Header[1]/ns0:wanCompanyLegalInfo[1]" w:storeItemID="{534044D7-BF80-4F39-BB01-2EBB277C890C}"/>
           <w:text/>
         </w:sdtPr>
+        <w:sdtEndPr/>
         <w:sdtContent>
           <w:tc>
             <w:tcPr>
@@ -2698,6 +2958,7 @@
                   <w:szCs w:val="18"/>
                 </w:rPr>
               </w:pPr>
+              <w:proofErr w:type="spellStart"/>
               <w:r>
                 <w:rPr>
                   <w:sz w:val="18"/>
@@ -2705,6 +2966,7 @@
                 </w:rPr>
                 <w:t>wanCompanyLegalInfo</w:t>
               </w:r>
+              <w:proofErr w:type="spellEnd"/>
             </w:p>
           </w:tc>
         </w:sdtContent>
@@ -2776,12 +3038,7 @@
     </w:tblPr>
     <w:tblGrid>
       <w:gridCol w:w="3089"/>
-      <w:gridCol w:w="3290"/>
-      <w:gridCol w:w="1134"/>
-      <w:gridCol w:w="992"/>
-      <w:gridCol w:w="567"/>
-      <w:gridCol w:w="1134"/>
-      <w:gridCol w:w="567"/>
+      <w:gridCol w:w="7684"/>
     </w:tblGrid>
     <w:tr>
       <w:sdt>
@@ -2799,6 +3056,11 @@
           <w:dataBinding w:prefixMappings="xmlns:ns0='urn:microsoft-dynamics-nav/reports/Standard_Sales_Order_Conf/1305/'" w:xpath="/ns0:NavWordReportXmlPart[1]/ns0:Header[1]/ns0:CompanyAddress1[1]" w:storeItemID="{534044D7-BF80-4F39-BB01-2EBB277C890C}"/>
           <w:text/>
         </w:sdtPr>
+        <w:sdtEndPr>
+          <w:rPr>
+            <w:rStyle w:val="lev"/>
+          </w:rPr>
+        </w:sdtEndPr>
         <w:sdtContent>
           <w:tc>
             <w:tcPr>
@@ -2825,7 +3087,6 @@
       <w:tc>
         <w:tcPr>
           <w:tcW w:w="7684" w:type="dxa"/>
-          <w:gridSpan w:val="6"/>
         </w:tcPr>
         <w:p>
           <w:pPr>
@@ -2851,7 +3112,13 @@
               <w:dataBinding w:prefixMappings="xmlns:ns0='urn:microsoft-dynamics-nav/reports/Standard_Sales_Order_Conf/1305/'" w:xpath="/ns0:NavWordReportXmlPart[1]/ns0:Header[1]/ns0:Invoice_Lbl[1]" w:storeItemID="{534044D7-BF80-4F39-BB01-2EBB277C890C}"/>
               <w:text/>
             </w:sdtPr>
+            <w:sdtEndPr>
+              <w:rPr>
+                <w:rStyle w:val="lev"/>
+              </w:rPr>
+            </w:sdtEndPr>
             <w:sdtContent>
+              <w:proofErr w:type="spellStart"/>
               <w:r>
                 <w:rPr>
                   <w:rStyle w:val="lev"/>
@@ -2859,6 +3126,7 @@
                 </w:rPr>
                 <w:t>Invoice_Lbl</w:t>
               </w:r>
+              <w:proofErr w:type="spellEnd"/>
             </w:sdtContent>
           </w:sdt>
           <w:r>
@@ -2883,7 +3151,13 @@
               <w:dataBinding w:prefixMappings="xmlns:ns0='urn:microsoft-dynamics-nav/reports/Standard_Sales_Order_Conf/1305/'" w:xpath="/ns0:NavWordReportXmlPart[1]/ns0:Header[1]/ns0:DocumentNo[1]" w:storeItemID="{534044D7-BF80-4F39-BB01-2EBB277C890C}"/>
               <w:text/>
             </w:sdtPr>
+            <w:sdtEndPr>
+              <w:rPr>
+                <w:rStyle w:val="lev"/>
+              </w:rPr>
+            </w:sdtEndPr>
             <w:sdtContent>
+              <w:proofErr w:type="spellStart"/>
               <w:r>
                 <w:rPr>
                   <w:rStyle w:val="lev"/>
@@ -2891,6 +3165,7 @@
                 </w:rPr>
                 <w:t>DocumentNo</w:t>
               </w:r>
+              <w:proofErr w:type="spellEnd"/>
             </w:sdtContent>
           </w:sdt>
         </w:p>
@@ -2908,6 +3183,7 @@
             <w:dataBinding w:prefixMappings="xmlns:ns0='urn:microsoft-dynamics-nav/reports/Standard_Sales_Order_Conf/1305/'" w:xpath="/ns0:NavWordReportXmlPart[1]/ns0:Header[1]/ns0:DocumentDate[1]" w:storeItemID="{534044D7-BF80-4F39-BB01-2EBB277C890C}"/>
             <w:text/>
           </w:sdtPr>
+          <w:sdtEndPr/>
           <w:sdtContent>
             <w:p>
               <w:pPr>
@@ -2917,12 +3193,14 @@
                   <w:lang w:val="fr-FR"/>
                 </w:rPr>
               </w:pPr>
+              <w:proofErr w:type="spellStart"/>
               <w:r>
                 <w:rPr>
                   <w:lang w:val="fr-FR"/>
                 </w:rPr>
                 <w:t>DocumentDate</w:t>
               </w:r>
+              <w:proofErr w:type="spellEnd"/>
             </w:p>
           </w:sdtContent>
         </w:sdt>
@@ -2949,13 +3227,16 @@
               <w:dataBinding w:prefixMappings="xmlns:ns0='urn:microsoft-dynamics-nav/reports/Standard_Sales_Order_Conf/1305/'" w:xpath="/ns0:NavWordReportXmlPart[1]/ns0:Header[1]/ns0:Page_Lbl[1]" w:storeItemID="{534044D7-BF80-4F39-BB01-2EBB277C890C}"/>
               <w:text/>
             </w:sdtPr>
+            <w:sdtEndPr/>
             <w:sdtContent>
+              <w:proofErr w:type="spellStart"/>
               <w:r>
                 <w:rPr>
                   <w:lang w:val="fr-FR"/>
                 </w:rPr>
                 <w:t>Page_Lbl</w:t>
               </w:r>
+              <w:proofErr w:type="spellEnd"/>
             </w:sdtContent>
           </w:sdt>
           <w:r>
@@ -3026,244 +3307,6 @@
           </w:r>
         </w:p>
       </w:tc>
-    </w:tr>
-    <w:tr>
-      <w:tblPrEx>
-        <w:tblCellMar>
-          <w:right w:w="113" w:type="dxa"/>
-        </w:tblCellMar>
-      </w:tblPrEx>
-      <w:trPr>
-        <w:cantSplit/>
-        <w:trHeight w:val="546"/>
-        <w:tblHeader/>
-      </w:trPr>
-      <w:sdt>
-        <w:sdtPr>
-          <w:rPr>
-            <w:szCs w:val="18"/>
-          </w:rPr>
-          <w:alias w:val="#Nav: /Header/Line/Description_Line_Lbl"/>
-          <w:tag w:val="#Nav: Standard_Sales_Order_Conf/1305"/>
-          <w:id w:val="-2032414259"/>
-          <w:placeholder>
-            <w:docPart w:val="F92940ED750341C4AEBF803173464171"/>
-          </w:placeholder>
-          <w:dataBinding w:prefixMappings="xmlns:ns0='urn:microsoft-dynamics-nav/reports/Standard_Sales_Order_Conf/1305/'" w:xpath="/ns0:NavWordReportXmlPart[1]/ns0:Header[1]/ns0:Line[1]/ns0:Description_Line_Lbl[1]" w:storeItemID="{534044D7-BF80-4F39-BB01-2EBB277C890C}"/>
-          <w:text/>
-        </w:sdtPr>
-        <w:sdtContent>
-          <w:tc>
-            <w:tcPr>
-              <w:tcW w:w="6379" w:type="dxa"/>
-              <w:gridSpan w:val="2"/>
-              <w:tcBorders>
-                <w:bottom w:val="single" w:color="auto" w:sz="4" w:space="0"/>
-              </w:tcBorders>
-              <w:vAlign w:val="bottom"/>
-            </w:tcPr>
-            <w:p>
-              <w:pPr>
-                <w:pStyle w:val="Titre1"/>
-                <w:rPr>
-                  <w:szCs w:val="18"/>
-                </w:rPr>
-              </w:pPr>
-              <w:r>
-                <w:rPr>
-                  <w:szCs w:val="18"/>
-                </w:rPr>
-                <w:t>Description_Line_Lbl</w:t>
-              </w:r>
-            </w:p>
-          </w:tc>
-        </w:sdtContent>
-      </w:sdt>
-      <w:sdt>
-        <w:sdtPr>
-          <w:rPr>
-            <w:szCs w:val="18"/>
-          </w:rPr>
-          <w:alias w:val="#Nav: /Header/Line/Quantity_Line_Lbl"/>
-          <w:tag w:val="#Nav: Standard_Sales_Order_Conf/1305"/>
-          <w:id w:val="367417715"/>
-          <w:placeholder>
-            <w:docPart w:val="F92940ED750341C4AEBF803173464171"/>
-          </w:placeholder>
-          <w:dataBinding w:prefixMappings="xmlns:ns0='urn:microsoft-dynamics-nav/reports/Standard_Sales_Order_Conf/1305/'" w:xpath="/ns0:NavWordReportXmlPart[1]/ns0:Header[1]/ns0:Line[1]/ns0:Quantity_Line_Lbl[1]" w:storeItemID="{534044D7-BF80-4F39-BB01-2EBB277C890C}"/>
-          <w:text/>
-        </w:sdtPr>
-        <w:sdtContent>
-          <w:tc>
-            <w:tcPr>
-              <w:tcW w:w="1134" w:type="dxa"/>
-              <w:tcBorders>
-                <w:bottom w:val="single" w:color="auto" w:sz="4" w:space="0"/>
-              </w:tcBorders>
-              <w:vAlign w:val="bottom"/>
-            </w:tcPr>
-            <w:p>
-              <w:pPr>
-                <w:pStyle w:val="Titre1"/>
-                <w:jc w:val="right"/>
-                <w:rPr>
-                  <w:szCs w:val="18"/>
-                </w:rPr>
-              </w:pPr>
-              <w:r>
-                <w:rPr>
-                  <w:szCs w:val="18"/>
-                </w:rPr>
-                <w:t>Quantity_Line_Lbl</w:t>
-              </w:r>
-            </w:p>
-          </w:tc>
-        </w:sdtContent>
-      </w:sdt>
-      <w:sdt>
-        <w:sdtPr>
-          <w:rPr>
-            <w:szCs w:val="18"/>
-          </w:rPr>
-          <w:alias w:val="#Nav: /Header/Line/UnitPrice_Lbl"/>
-          <w:tag w:val="#Nav: Standard_Sales_Order_Conf/1305"/>
-          <w:id w:val="-376551249"/>
-          <w:placeholder>
-            <w:docPart w:val="F92940ED750341C4AEBF803173464171"/>
-          </w:placeholder>
-          <w:dataBinding w:prefixMappings="xmlns:ns0='urn:microsoft-dynamics-nav/reports/Standard_Sales_Order_Conf/1305/'" w:xpath="/ns0:NavWordReportXmlPart[1]/ns0:Header[1]/ns0:Line[1]/ns0:UnitPrice_Lbl[1]" w:storeItemID="{534044D7-BF80-4F39-BB01-2EBB277C890C}"/>
-          <w:text/>
-        </w:sdtPr>
-        <w:sdtContent>
-          <w:tc>
-            <w:tcPr>
-              <w:tcW w:w="992" w:type="dxa"/>
-              <w:tcBorders>
-                <w:bottom w:val="single" w:color="auto" w:sz="4" w:space="0"/>
-              </w:tcBorders>
-              <w:vAlign w:val="bottom"/>
-            </w:tcPr>
-            <w:p>
-              <w:pPr>
-                <w:pStyle w:val="Titre1"/>
-                <w:jc w:val="right"/>
-                <w:rPr>
-                  <w:szCs w:val="18"/>
-                </w:rPr>
-              </w:pPr>
-              <w:r>
-                <w:rPr>
-                  <w:szCs w:val="18"/>
-                </w:rPr>
-                <w:t>UnitPrice_Lbl</w:t>
-              </w:r>
-            </w:p>
-          </w:tc>
-        </w:sdtContent>
-      </w:sdt>
-      <w:tc>
-        <w:tcPr>
-          <w:tcW w:w="567" w:type="dxa"/>
-          <w:tcBorders>
-            <w:bottom w:val="single" w:color="auto" w:sz="4" w:space="0"/>
-          </w:tcBorders>
-          <w:vAlign w:val="bottom"/>
-        </w:tcPr>
-        <w:p>
-          <w:pPr>
-            <w:pStyle w:val="Titre1"/>
-            <w:jc w:val="right"/>
-            <w:rPr>
-              <w:szCs w:val="18"/>
-            </w:rPr>
-          </w:pPr>
-        </w:p>
-      </w:tc>
-      <w:sdt>
-        <w:sdtPr>
-          <w:rPr>
-            <w:szCs w:val="18"/>
-          </w:rPr>
-          <w:alias w:val="#Nav: /Header/Line/LineAmount_Line_Lbl"/>
-          <w:tag w:val="#Nav: Standard_Sales_Order_Conf/1305"/>
-          <w:id w:val="-1521308041"/>
-          <w:placeholder>
-            <w:docPart w:val="F92940ED750341C4AEBF803173464171"/>
-          </w:placeholder>
-          <w:dataBinding w:prefixMappings="xmlns:ns0='urn:microsoft-dynamics-nav/reports/Standard_Sales_Order_Conf/1305/'" w:xpath="/ns0:NavWordReportXmlPart[1]/ns0:Header[1]/ns0:Line[1]/ns0:LineAmount_Line_Lbl[1]" w:storeItemID="{534044D7-BF80-4F39-BB01-2EBB277C890C}"/>
-          <w:text/>
-        </w:sdtPr>
-        <w:sdtContent>
-          <w:tc>
-            <w:tcPr>
-              <w:tcW w:w="1134" w:type="dxa"/>
-              <w:tcBorders>
-                <w:bottom w:val="single" w:color="auto" w:sz="4" w:space="0"/>
-              </w:tcBorders>
-              <w:tcMar>
-                <w:right w:w="0" w:type="dxa"/>
-              </w:tcMar>
-              <w:vAlign w:val="bottom"/>
-            </w:tcPr>
-            <w:p>
-              <w:pPr>
-                <w:pStyle w:val="Titre1"/>
-                <w:jc w:val="right"/>
-                <w:rPr>
-                  <w:szCs w:val="18"/>
-                </w:rPr>
-              </w:pPr>
-              <w:r>
-                <w:rPr>
-                  <w:szCs w:val="18"/>
-                </w:rPr>
-                <w:t>LineAmount_Line_Lbl</w:t>
-              </w:r>
-            </w:p>
-          </w:tc>
-        </w:sdtContent>
-      </w:sdt>
-      <w:sdt>
-        <w:sdtPr>
-          <w:rPr>
-            <w:szCs w:val="18"/>
-          </w:rPr>
-          <w:alias w:val="#Nav: /Header/Line/VATPct_Line_Lbl"/>
-          <w:tag w:val="#Nav: Standard_Sales_Order_Conf/1305"/>
-          <w:id w:val="2095976510"/>
-          <w:placeholder>
-            <w:docPart w:val="7BECBE18CEF04507B084430683B0775D"/>
-          </w:placeholder>
-          <w:dataBinding w:prefixMappings="xmlns:ns0='urn:microsoft-dynamics-nav/reports/Standard_Sales_Order_Conf/1305/'" w:xpath="/ns0:NavWordReportXmlPart[1]/ns0:Header[1]/ns0:Line[1]/ns0:VATPct_Line_Lbl[1]" w:storeItemID="{534044D7-BF80-4F39-BB01-2EBB277C890C}"/>
-          <w:text/>
-        </w:sdtPr>
-        <w:sdtContent>
-          <w:tc>
-            <w:tcPr>
-              <w:tcW w:w="567" w:type="dxa"/>
-              <w:tcBorders>
-                <w:bottom w:val="single" w:color="auto" w:sz="4" w:space="0"/>
-              </w:tcBorders>
-              <w:vAlign w:val="bottom"/>
-            </w:tcPr>
-            <w:p>
-              <w:pPr>
-                <w:pStyle w:val="Titre1"/>
-                <w:jc w:val="right"/>
-                <w:rPr>
-                  <w:szCs w:val="18"/>
-                </w:rPr>
-              </w:pPr>
-              <w:r>
-                <w:rPr>
-                  <w:szCs w:val="18"/>
-                </w:rPr>
-                <w:t>VATPct_Line_Lbl</w:t>
-              </w:r>
-            </w:p>
-          </w:tc>
-        </w:sdtContent>
-      </w:sdt>
     </w:tr>
   </w:tbl>
   <w:p>
@@ -3319,6 +3362,7 @@
             <w:dataBinding w:prefixMappings="xmlns:ns0='urn:microsoft-dynamics-nav/reports/Standard_Sales_Order_Conf/1305/'" w:xpath="/ns0:NavWordReportXmlPart[1]/ns0:Header[1]/ns0:CompanyPicture[1]" w:storeItemID="{534044D7-BF80-4F39-BB01-2EBB277C890C}"/>
             <w:picture/>
           </w:sdtPr>
+          <w:sdtEndPr/>
           <w:sdtContent>
             <w:p>
               <w:pPr>
@@ -3422,7 +3466,9 @@
               <w:dataBinding w:prefixMappings="xmlns:ns0='urn:microsoft-dynamics-nav/reports/Standard_Sales_Order_Conf/1305/'" w:xpath="/ns0:NavWordReportXmlPart[1]/ns0:Header[1]/ns0:Invoice_Lbl[1]" w:storeItemID="{534044D7-BF80-4F39-BB01-2EBB277C890C}"/>
               <w:text/>
             </w:sdtPr>
+            <w:sdtEndPr/>
             <w:sdtContent>
+              <w:proofErr w:type="spellStart"/>
               <w:r>
                 <w:rPr>
                   <w:b/>
@@ -3431,6 +3477,7 @@
                 </w:rPr>
                 <w:t>Invoice_Lbl</w:t>
               </w:r>
+              <w:proofErr w:type="spellEnd"/>
             </w:sdtContent>
           </w:sdt>
           <w:r>
@@ -3457,7 +3504,9 @@
               <w:dataBinding w:prefixMappings="xmlns:ns0='urn:microsoft-dynamics-nav/reports/Standard_Sales_Order_Conf/1305/'" w:xpath="/ns0:NavWordReportXmlPart[1]/ns0:Header[1]/ns0:DocumentNo[1]" w:storeItemID="{534044D7-BF80-4F39-BB01-2EBB277C890C}"/>
               <w:text/>
             </w:sdtPr>
+            <w:sdtEndPr/>
             <w:sdtContent>
+              <w:proofErr w:type="spellStart"/>
               <w:r>
                 <w:rPr>
                   <w:b/>
@@ -3466,6 +3515,7 @@
                 </w:rPr>
                 <w:t>DocumentNo</w:t>
               </w:r>
+              <w:proofErr w:type="spellEnd"/>
             </w:sdtContent>
           </w:sdt>
         </w:p>
@@ -3488,6 +3538,7 @@
             <w:dataBinding w:prefixMappings="xmlns:ns0='urn:microsoft-dynamics-nav/reports/Standard_Sales_Order_Conf/1305/'" w:xpath="/ns0:NavWordReportXmlPart[1]/ns0:Header[1]/ns0:DocumentDate[1]" w:storeItemID="{534044D7-BF80-4F39-BB01-2EBB277C890C}"/>
             <w:text/>
           </w:sdtPr>
+          <w:sdtEndPr/>
           <w:sdtContent>
             <w:p>
               <w:pPr>
@@ -3502,6 +3553,7 @@
                   <w:lang w:val="fr-FR"/>
                 </w:rPr>
               </w:pPr>
+              <w:proofErr w:type="spellStart"/>
               <w:r>
                 <w:rPr>
                   <w:rFonts w:asciiTheme="majorHAnsi" w:hAnsiTheme="majorHAnsi"/>
@@ -3513,6 +3565,7 @@
                 </w:rPr>
                 <w:t>DocumentDate</w:t>
               </w:r>
+              <w:proofErr w:type="spellEnd"/>
             </w:p>
           </w:sdtContent>
         </w:sdt>
@@ -3548,7 +3601,9 @@
               <w:dataBinding w:prefixMappings="xmlns:ns0='urn:microsoft-dynamics-nav/reports/Standard_Sales_Order_Conf/1305/'" w:xpath="/ns0:NavWordReportXmlPart[1]/ns0:Header[1]/ns0:Page_Lbl[1]" w:storeItemID="{534044D7-BF80-4F39-BB01-2EBB277C890C}"/>
               <w:text/>
             </w:sdtPr>
+            <w:sdtEndPr/>
             <w:sdtContent>
+              <w:proofErr w:type="spellStart"/>
               <w:r>
                 <w:rPr>
                   <w:rFonts w:asciiTheme="majorHAnsi" w:hAnsiTheme="majorHAnsi"/>
@@ -3560,6 +3615,7 @@
                 </w:rPr>
                 <w:t>Page_Lbl</w:t>
               </w:r>
+              <w:proofErr w:type="spellEnd"/>
             </w:sdtContent>
           </w:sdt>
           <w:r>
@@ -5304,64 +5360,6 @@
     </w:docPart>
     <w:docPart>
       <w:docPartPr>
-        <w:name w:val="F92940ED750341C4AEBF803173464171"/>
-        <w:category>
-          <w:name w:val="Général"/>
-          <w:gallery w:val="placeholder"/>
-        </w:category>
-        <w:types>
-          <w:type w:val="bbPlcHdr"/>
-        </w:types>
-        <w:behaviors>
-          <w:behavior w:val="content"/>
-        </w:behaviors>
-        <w:guid w:val="{A8168B21-B684-46EA-8962-848EC9B470C5}"/>
-      </w:docPartPr>
-      <w:docPartBody>
-        <w:p>
-          <w:pPr>
-            <w:pStyle w:val="F92940ED750341C4AEBF803173464171"/>
-          </w:pPr>
-          <w:r>
-            <w:rPr>
-              <w:rStyle w:val="Textedelespacerserv"/>
-            </w:rPr>
-            <w:t>Click here to enter text.</w:t>
-          </w:r>
-        </w:p>
-      </w:docPartBody>
-    </w:docPart>
-    <w:docPart>
-      <w:docPartPr>
-        <w:name w:val="7BECBE18CEF04507B084430683B0775D"/>
-        <w:category>
-          <w:name w:val="Général"/>
-          <w:gallery w:val="placeholder"/>
-        </w:category>
-        <w:types>
-          <w:type w:val="bbPlcHdr"/>
-        </w:types>
-        <w:behaviors>
-          <w:behavior w:val="content"/>
-        </w:behaviors>
-        <w:guid w:val="{B213540D-C865-4BB5-BF20-4B099A88780D}"/>
-      </w:docPartPr>
-      <w:docPartBody>
-        <w:p>
-          <w:pPr>
-            <w:pStyle w:val="7BECBE18CEF04507B084430683B0775D"/>
-          </w:pPr>
-          <w:r>
-            <w:rPr>
-              <w:rStyle w:val="Textedelespacerserv"/>
-            </w:rPr>
-            <w:t>Click here to enter text.</w:t>
-          </w:r>
-        </w:p>
-      </w:docPartBody>
-    </w:docPart>
-    <w:docPart>
-      <w:docPartPr>
         <w:name w:val="BE0BAD3793BC47D18D591FAC29907553"/>
         <w:category>
           <w:name w:val="Général"/>
@@ -5503,6 +5501,7 @@
     <w:rsid w:val="00580879"/>
     <w:rsid w:val="006D6EBD"/>
     <w:rsid w:val="006E43C7"/>
+    <w:rsid w:val="00721771"/>
     <w:rsid w:val="00747F0A"/>
     <w:rsid w:val="007B7266"/>
     <w:rsid w:val="00805499"/>
@@ -6561,7 +6560,11 @@
 </we:webextension>
 </file>
 
-<file path=customXml/item1.xml>��< ? x m l   v e r s i o n = " 1 . 0 "   e n c o d i n g = " u t f - 1 6 " ? > +<file path=customXml/item1.xml><?xml version="1.0" encoding="utf-8"?>
+<b:Sources xmlns:b="http://schemas.openxmlformats.org/officeDocument/2006/bibliography" xmlns="http://schemas.openxmlformats.org/officeDocument/2006/bibliography" SelectedStyle="\APASixthEditionOfficeOnline.xsl" StyleName="APA" Version="6"/>
+</file>
+
+<file path=customXml/item2.xml>��< ? x m l   v e r s i o n = " 1 . 0 "   e n c o d i n g = " u t f - 1 6 " ? >   
  < N a v W o r d R e p o r t X m l P a r t   x m l n s = " u r n : m i c r o s o f t - d y n a m i c s - n a v / r e p o r t s / S t a n d a r d _ S a l e s _ O r d e r _ C o n f / 1 3 0 5 / " >   
@@ -7108,22 +7111,18 @@
  < / N a v W o r d R e p o r t X m l P a r t > 
 </file>
 
-<file path=customXml/item2.xml><?xml version="1.0" encoding="utf-8"?>
-<b:Sources xmlns:b="http://schemas.openxmlformats.org/officeDocument/2006/bibliography" xmlns="http://schemas.openxmlformats.org/officeDocument/2006/bibliography" SelectedStyle="\APASixthEditionOfficeOnline.xsl" StyleName="APA" Version="6"/>
+<file path=customXml/itemProps1.xml><?xml version="1.0" encoding="utf-8"?>
+<ds:datastoreItem xmlns:ds="http://schemas.openxmlformats.org/officeDocument/2006/customXml" ds:itemID="{AF0DAB20-447E-46A8-9033-E680D6E7DCDF}">
+  <ds:schemaRefs>
+    <ds:schemaRef ds:uri="http://schemas.openxmlformats.org/officeDocument/2006/bibliography"/>
+  </ds:schemaRefs>
+</ds:datastoreItem>
 </file>
 
-<file path=customXml/itemProps1.xml><?xml version="1.0" encoding="utf-8"?>
+<file path=customXml/itemProps2.xml><?xml version="1.0" encoding="utf-8"?>
 <ds:datastoreItem xmlns:ds="http://schemas.openxmlformats.org/officeDocument/2006/customXml" ds:itemID="{534044D7-BF80-4F39-BB01-2EBB277C890C}">
   <ds:schemaRefs>
     <ds:schemaRef ds:uri="urn:microsoft-dynamics-nav/reports/Standard_Sales_Order_Conf/1305/"/>
   </ds:schemaRefs>
 </ds:datastoreItem>
-</file>
-
-<file path=customXml/itemProps2.xml><?xml version="1.0" encoding="utf-8"?>
-<ds:datastoreItem xmlns:ds="http://schemas.openxmlformats.org/officeDocument/2006/customXml" ds:itemID="{AF0DAB20-447E-46A8-9033-E680D6E7DCDF}">
-  <ds:schemaRefs>
-    <ds:schemaRef ds:uri="http://schemas.openxmlformats.org/officeDocument/2006/bibliography"/>
-  </ds:schemaRefs>
-</ds:datastoreItem>
 </file>
</xml_diff>